<commit_message>
Import exact reviewed Project Lead media revision and preserve provenance
</commit_message>
<xml_diff>
--- a/media/Control_Anchor_Video_Scripts_Reviewer_Update.docx
+++ b/media/Control_Anchor_Video_Scripts_Reviewer_Update.docx
@@ -71,7 +71,7 @@
     <w:p>
       <w:pPr/>
       <w:r>
-        <w:t>971 spoken words. Allow about 8 to 9 minutes at 125 to 140 words per minute, including pauses and transitions. These are planning estimates, not measured chapter times. Each numbered slide section can be a separate take.</w:t>
+        <w:t>974 spoken words. Allow about 8 to 9 minutes at 125 to 140 words per minute, including pauses and transitions. These are planning estimates, not measured chapter times. Each numbered slide section can be a separate take.</w:t>
       </w:r>
     </w:p>
     <w:p>
@@ -124,7 +124,7 @@
         <w:pStyle w:val="Spokennarration"/>
       </w:pPr>
       <w:r>
-        <w:t>I'm Thomas Prislac. My background includes auditing, internal controls, music and creative work. I'm interested in what people can create with AI, and how we understand what we're relying on.</w:t>
+        <w:t>I'm the project lead. My background includes auditing, internal controls, music and creative work. I'm interested in what people can create with AI, and how we understand what we're relying on.</w:t>
       </w:r>
     </w:p>
     <w:p>
@@ -520,7 +520,7 @@
         <w:pStyle w:val="Spokennarration"/>
       </w:pPr>
       <w:r>
-        <w:t>I'm Thomas. Thanks for taking a look at the work.</w:t>
+        <w:t>I'm the project lead. Thanks for taking a look at the work.</w:t>
       </w:r>
     </w:p>
     <w:p>
@@ -593,7 +593,7 @@
         <w:rPr>
           <w:b w:val="0"/>
         </w:rPr>
-        <w:t>I’m Thomas. This walkthrough covers the alpha version and environment shown on screen. I’ll show you where to find its instructions, complete one synthetic task, inspect the evidence, make a correction and reopen the record. The version matters: an older test result doesn’t automatically cover a newer package.</w:t>
+        <w:t>I’m the project lead. This walkthrough covers the alpha version and environment shown on screen. I’ll show you where to find its instructions, complete one synthetic task, inspect the evidence, make a correction and reopen the record. The version matters: an older test result doesn’t automatically cover a newer package.</w:t>
       </w:r>
     </w:p>
     <w:p>
@@ -846,7 +846,7 @@
         <w:rPr>
           <w:sz w:val="20"/>
         </w:rPr>
-        <w:t>Use the supported correction/follow-up route. Show preserved original and corrected parent. Show fresh analysis linked to the correction only when it actually completes. Record Thomas’s own scoped review if supported; leave earlier simulated reviews attributed correctly.</w:t>
+        <w:t>Use the supported correction/follow-up route. Show preserved original and corrected parent. Show fresh analysis linked to the correction only when it actually completes. Record the project lead’s own scoped review if supported; leave earlier simulated reviews attributed correctly.</w:t>
       </w:r>
     </w:p>
     <w:p>
@@ -960,7 +960,7 @@
         <w:rPr>
           <w:sz w:val="20"/>
         </w:rPr>
-        <w:t>Return to README and the current contribution route. Point to the specific demonstrated version and a transcript. Close on Thomas rather than a wall of commit hashes.</w:t>
+        <w:t>Return to README and the current contribution route. Point to the specific demonstrated version and a transcript. Close on the project lead rather than a wall of commit hashes.</w:t>
       </w:r>
     </w:p>
     <w:p>
@@ -1070,7 +1070,7 @@
         <w:rPr>
           <w:b w:val="0"/>
         </w:rPr>
-        <w:t>I’m Thomas Prislac. Control Anchor is a project to make AI work easier to question, correct and use under understandable human controls. This introduction explains the intended native Windows and supported AI-host design, possible small-business and family uses, and the longer-term research into permitted reuse and cooperative resources. It is a design and development introduction, not a demonstration of a finished product.</w:t>
+        <w:t>I’m the project lead. Control Anchor is a project to make AI work easier to question, correct and use under understandable human controls. This introduction explains the intended native Windows and supported AI-host design, possible small-business and family uses, and the longer-term research into permitted reuse and cooperative resources. It is a design and development introduction, not a demonstration of a finished product.</w:t>
       </w:r>
     </w:p>
     <w:p>
@@ -1117,7 +1117,7 @@
           <w:rPr>
             <w:color w:val="234F68"/>
           </w:rPr>
-          <w:t>Contact Thomas about a task or collaboration</w:t>
+          <w:t>Contact the project lead about a task or collaboration</w:t>
         </w:r>
       </w:hyperlink>
     </w:p>
@@ -1183,7 +1183,7 @@
     </w:p>
     <w:p>
       <w:r>
-        <w:t>Introduction: Meet Thomas; source meaning; quotation example; readable controls; unified product; roles; correction; family use and peer research; dated evidence; invitation.</w:t>
+        <w:t>Introduction: Meet the project lead; source meaning; quotation example; readable controls; unified product; roles; correction; family use and peer research; dated evidence; invitation.</w:t>
         <w:br/>
         <w:t>Tutorial: Version and instructions • Repository navigation • Start • Select task and rule • Inspect • Correct and review • Export and reopen • Contribute.</w:t>
       </w:r>
@@ -1235,7 +1235,7 @@
         <w:rPr>
           <w:b w:val="0"/>
         </w:rPr>
-        <w:t>Use “Meet Thomas and see the project” as the section title. Publish the introduction row once its real URL exists; add the walkthrough row when that video exists. Keep the white paper and written instructions beside the videos so watching is optional.</w:t>
+        <w:t>Use “Meet the project lead and see the project” as the section title. Publish the introduction row once its real URL exists; add the walkthrough row when that video exists. Keep the white paper and written instructions beside the videos so watching is optional.</w:t>
       </w:r>
     </w:p>
     <w:tbl>
@@ -1339,7 +1339,7 @@
               <w:rPr>
                 <w:sz w:val="20"/>
               </w:rPr>
-              <w:t>Meet Thomas and Control Anchor</w:t>
+              <w:t>Meet the project lead and Control Anchor</w:t>
             </w:r>
           </w:p>
         </w:tc>
@@ -1445,10 +1445,10 @@
         <w:rPr>
           <w:b w:val="0"/>
         </w:rPr>
-        <w:t>Meet Thomas and see the project</w:t>
+        <w:t>Meet the project lead and see the project</w:t>
         <w:br/>
         <w:br/>
-        <w:t>Watch Thomas explain why he is building Control Anchor, who it could help and how to take part. The introduction describes the design and development goals. The separately versioned early-alpha walkthrough shows only the behavior demonstrated by that edition. Start with the written guide if you prefer to read.</w:t>
+        <w:t>Watch the project lead explain why he is building Control Anchor, who it could help and how to take part. The introduction describes the design and development goals. The separately versioned early-alpha walkthrough shows only the behavior demonstrated by that edition. Start with the written guide if you prefer to read.</w:t>
       </w:r>
     </w:p>
     <w:p>
@@ -1507,7 +1507,7 @@
         <w:rPr>
           <w:b w:val="0"/>
         </w:rPr>
-        <w:t>Open a documentation-only change with the actual video URLs, recorded version/date and transcripts. Read back the links and verify their intended audience can open them. Thomas retains merge authority.</w:t>
+        <w:t>Open a documentation-only change with the actual video URLs, recorded version/date and transcripts. Read back the links and verify their intended audience can open them. The project lead retains merge authority.</w:t>
       </w:r>
     </w:p>
     <w:p>

</xml_diff>